<commit_message>
Finalize revision package: image widths, preview PDFs, report corrections
Co-Authored-By: Claude Fable 5.1 <noreply@anthropic.com>
Claude-Session: https://claude.ai/code/session_011m1nWiFCs4xdp8CXy2DSzu
</commit_message>
<xml_diff>
--- a/DFT_paper_revision/REVISION_REPORT.docx
+++ b/DFT_paper_revision/REVISION_REPORT.docx
@@ -2271,7 +2271,7 @@
               <w:rPr>
                 <w:rStyle w:val="VerbatimChar"/>
               </w:rPr>
-              <w:t xml:space="preserve">.pdf</w:t>
+              <w:t xml:space="preserve">_PREVIEW.pdf</w:t>
             </w:r>
             <w:r>
               <w:t xml:space="preserve">)</w:t>
@@ -2286,7 +2286,7 @@
               <w:jc w:val="left"/>
             </w:pPr>
             <w:r>
-              <w:t xml:space="preserve">revised manuscript with [AUTHOR ACTION] markers</w:t>
+              <w:t xml:space="preserve">revised manuscript with [AUTHOR ACTION] markers; the PDF is a reading preview rendered from the Markdown source, not from the Word file</w:t>
             </w:r>
           </w:p>
         </w:tc>
@@ -2387,6 +2387,18 @@
                 <w:rStyle w:val="VerbatimChar"/>
               </w:rPr>
               <w:t xml:space="preserve">.md</w:t>
+            </w:r>
+            <w:r>
+              <w:t xml:space="preserve">,</w:t>
+            </w:r>
+            <w:r>
+              <w:t xml:space="preserve"> </w:t>
+            </w:r>
+            <w:r>
+              <w:rPr>
+                <w:rStyle w:val="VerbatimChar"/>
+              </w:rPr>
+              <w:t xml:space="preserve">_PREVIEW.pdf</w:t>
             </w:r>
             <w:r>
               <w:t xml:space="preserve">)</w:t>
@@ -2618,7 +2630,37 @@
         <w:pStyle w:val="FirstParagraph"/>
       </w:pPr>
       <w:r>
-        <w:t xml:space="preserve">I cannot run Quantum ESPRESSO here, open your archive, or read your output files, so nothing in v4 is a new result. I cannot submit on your behalf: submission must be made by the corresponding author through the journal’s portal after all co-authors approve. Publisher, Scimago and DOI landing pages were blocked from this environment, so journal metrics and the four flagged references rest on secondary sources and need your confirmation.</w:t>
+        <w:t xml:space="preserve">The six Word files pass the Office Open XML schema validator; LibreOffice is not functional in the preparation environment, so their page layout was checked on a Chromium render of the same Markdown source (the</w:t>
+      </w:r>
+      <w:r>
+        <w:t xml:space="preserve"> </w:t>
+      </w:r>
+      <w:r>
+        <w:rPr>
+          <w:rStyle w:val="VerbatimChar"/>
+        </w:rPr>
+        <w:t xml:space="preserve">_PREVIEW.pdf</w:t>
+      </w:r>
+      <w:r>
+        <w:t xml:space="preserve"> </w:t>
+      </w:r>
+      <w:r>
+        <w:t xml:space="preserve">files). Open each</w:t>
+      </w:r>
+      <w:r>
+        <w:t xml:space="preserve"> </w:t>
+      </w:r>
+      <w:r>
+        <w:rPr>
+          <w:rStyle w:val="VerbatimChar"/>
+        </w:rPr>
+        <w:t xml:space="preserve">.docx</w:t>
+      </w:r>
+      <w:r>
+        <w:t xml:space="preserve"> </w:t>
+      </w:r>
+      <w:r>
+        <w:t xml:space="preserve">in Word once before editing. I cannot run Quantum ESPRESSO here, open your archive, or read your output files, so nothing in v4 is a new result. I cannot submit on your behalf: submission must be made by the corresponding author through the journal’s portal after all co-authors approve. Publisher, Scimago and DOI landing pages were blocked from this environment, so journal metrics and the four flagged references rest on secondary sources and need your confirmation.</w:t>
       </w:r>
     </w:p>
     <w:bookmarkEnd w:id="27"/>

</xml_diff>